<commit_message>
Menambahkan file remedial bank
</commit_message>
<xml_diff>
--- a/CC_PROJECT.docx
+++ b/CC_PROJECT.docx
@@ -173,6 +173,14 @@
       <w:r>
         <w:t xml:space="preserve">FAJAR </w:t>
       </w:r>
+      <w:r>
+        <w:t>DANUAR PERMANA</w:t>
+      </w:r>
+    </w:p>
+    <w:p>
+      <w:pPr>
+        <w:jc w:val="center"/>
+      </w:pPr>
     </w:p>
     <w:p>
       <w:pPr>
@@ -232,9 +240,9 @@
         <w:t>UNIVERSITAS NUSA PUTRA SUKABUMI</w:t>
       </w:r>
     </w:p>
-    <w:p/>
     <w:p>
       <w:pPr>
+        <w:ind w:left="-284"/>
         <w:jc w:val="both"/>
         <w:rPr>
           <w:b/>
@@ -393,6 +401,11 @@
           <w:ilvl w:val="0"/>
           <w:numId w:val="1"/>
         </w:numPr>
+        <w:tabs>
+          <w:tab w:val="clear" w:pos="720"/>
+          <w:tab w:val="num" w:pos="426"/>
+        </w:tabs>
+        <w:ind w:left="426"/>
         <w:jc w:val="both"/>
       </w:pPr>
       <w:r>
@@ -540,6 +553,11 @@
           <w:ilvl w:val="0"/>
           <w:numId w:val="1"/>
         </w:numPr>
+        <w:tabs>
+          <w:tab w:val="clear" w:pos="720"/>
+          <w:tab w:val="num" w:pos="426"/>
+        </w:tabs>
+        <w:ind w:left="426"/>
         <w:jc w:val="both"/>
       </w:pPr>
       <w:r>
@@ -599,6 +617,11 @@
           <w:ilvl w:val="0"/>
           <w:numId w:val="1"/>
         </w:numPr>
+        <w:tabs>
+          <w:tab w:val="clear" w:pos="720"/>
+          <w:tab w:val="num" w:pos="426"/>
+        </w:tabs>
+        <w:ind w:left="426"/>
         <w:jc w:val="both"/>
       </w:pPr>
       <w:r>
@@ -658,6 +681,11 @@
           <w:ilvl w:val="0"/>
           <w:numId w:val="1"/>
         </w:numPr>
+        <w:tabs>
+          <w:tab w:val="clear" w:pos="720"/>
+          <w:tab w:val="num" w:pos="426"/>
+        </w:tabs>
+        <w:ind w:left="426"/>
         <w:jc w:val="both"/>
       </w:pPr>
       <w:r>
@@ -842,31 +870,36 @@
           <w:ilvl w:val="0"/>
           <w:numId w:val="6"/>
         </w:numPr>
+        <w:tabs>
+          <w:tab w:val="clear" w:pos="720"/>
+          <w:tab w:val="num" w:pos="426"/>
+        </w:tabs>
+        <w:ind w:left="426"/>
         <w:jc w:val="both"/>
       </w:pPr>
-      <w:r>
-        <w:rPr>
-          <w:b/>
-          <w:bCs/>
-        </w:rPr>
-        <w:t>Processor (</w:t>
-      </w:r>
-      <w:proofErr w:type="spellStart"/>
-      <w:r>
-        <w:rPr>
-          <w:b/>
-          <w:bCs/>
-        </w:rPr>
-        <w:t>Otak</w:t>
-      </w:r>
-      <w:proofErr w:type="spellEnd"/>
-      <w:r>
-        <w:rPr>
-          <w:b/>
-          <w:bCs/>
-        </w:rPr>
-        <w:t>):</w:t>
-      </w:r>
+      <w:proofErr w:type="gramStart"/>
+      <w:r>
+        <w:rPr>
+          <w:b/>
+          <w:bCs/>
+        </w:rPr>
+        <w:t>Processor</w:t>
+      </w:r>
+      <w:r>
+        <w:rPr>
+          <w:b/>
+          <w:bCs/>
+        </w:rPr>
+        <w:t xml:space="preserve"> </w:t>
+      </w:r>
+      <w:r>
+        <w:rPr>
+          <w:b/>
+          <w:bCs/>
+        </w:rPr>
+        <w:t>:</w:t>
+      </w:r>
+      <w:proofErr w:type="gramEnd"/>
       <w:r>
         <w:t xml:space="preserve"> 2x Intel Xeon Silver </w:t>
       </w:r>
@@ -888,7 +921,7 @@
         <w:tabs>
           <w:tab w:val="clear" w:pos="1440"/>
         </w:tabs>
-        <w:ind w:left="1134"/>
+        <w:ind w:left="851"/>
         <w:jc w:val="both"/>
       </w:pPr>
       <w:r>
@@ -957,6 +990,10 @@
           <w:ilvl w:val="0"/>
           <w:numId w:val="6"/>
         </w:numPr>
+        <w:tabs>
+          <w:tab w:val="clear" w:pos="720"/>
+        </w:tabs>
+        <w:ind w:left="426"/>
         <w:jc w:val="both"/>
       </w:pPr>
       <w:r>
@@ -988,7 +1025,7 @@
           <w:tab w:val="clear" w:pos="1440"/>
           <w:tab w:val="num" w:pos="1134"/>
         </w:tabs>
-        <w:ind w:left="1134"/>
+        <w:ind w:left="851"/>
         <w:jc w:val="both"/>
       </w:pPr>
       <w:r>
@@ -1081,6 +1118,11 @@
           <w:ilvl w:val="0"/>
           <w:numId w:val="6"/>
         </w:numPr>
+        <w:tabs>
+          <w:tab w:val="clear" w:pos="720"/>
+          <w:tab w:val="num" w:pos="426"/>
+        </w:tabs>
+        <w:ind w:left="426"/>
         <w:jc w:val="both"/>
       </w:pPr>
       <w:r>
@@ -1115,15 +1157,7 @@
       </w:r>
       <w:proofErr w:type="spellEnd"/>
       <w:r>
-        <w:t xml:space="preserve"> (</w:t>
-      </w:r>
-      <w:proofErr w:type="spellStart"/>
-      <w:r>
-        <w:t>Konfigurasi</w:t>
-      </w:r>
-      <w:proofErr w:type="spellEnd"/>
-      <w:r>
-        <w:t xml:space="preserve"> RAID 1).</w:t>
+        <w:t>.</w:t>
       </w:r>
     </w:p>
     <w:p>
@@ -1134,9 +1168,10 @@
         </w:numPr>
         <w:tabs>
           <w:tab w:val="clear" w:pos="1440"/>
+          <w:tab w:val="num" w:pos="993"/>
           <w:tab w:val="num" w:pos="1134"/>
         </w:tabs>
-        <w:ind w:left="1134"/>
+        <w:ind w:left="851"/>
         <w:jc w:val="both"/>
       </w:pPr>
       <w:r>
@@ -1237,6 +1272,11 @@
           <w:ilvl w:val="0"/>
           <w:numId w:val="6"/>
         </w:numPr>
+        <w:tabs>
+          <w:tab w:val="clear" w:pos="720"/>
+          <w:tab w:val="num" w:pos="426"/>
+        </w:tabs>
+        <w:ind w:left="426"/>
         <w:jc w:val="both"/>
       </w:pPr>
       <w:r>
@@ -1258,9 +1298,10 @@
         </w:numPr>
         <w:tabs>
           <w:tab w:val="clear" w:pos="1440"/>
+          <w:tab w:val="num" w:pos="993"/>
           <w:tab w:val="num" w:pos="1134"/>
         </w:tabs>
-        <w:ind w:left="1134"/>
+        <w:ind w:left="851"/>
         <w:jc w:val="both"/>
       </w:pPr>
       <w:r>
@@ -1301,22 +1342,12 @@
     </w:p>
     <w:p>
       <w:pPr>
-        <w:ind w:left="360"/>
         <w:jc w:val="both"/>
       </w:pPr>
     </w:p>
     <w:p>
       <w:pPr>
-        <w:jc w:val="both"/>
-      </w:pPr>
-      <w:r>
-        <w:pict w14:anchorId="7449D0EE">
-          <v:rect id="_x0000_i1025" style="width:0;height:1.5pt" o:hralign="center" o:hrstd="t" o:hr="t" fillcolor="#a0a0a0" stroked="f"/>
-        </w:pict>
-      </w:r>
-    </w:p>
-    <w:p>
-      <w:pPr>
+        <w:ind w:left="-284"/>
         <w:jc w:val="both"/>
         <w:rPr>
           <w:b/>
@@ -1442,6 +1473,10 @@
           <w:ilvl w:val="0"/>
           <w:numId w:val="2"/>
         </w:numPr>
+        <w:tabs>
+          <w:tab w:val="clear" w:pos="720"/>
+        </w:tabs>
+        <w:ind w:left="426"/>
         <w:jc w:val="both"/>
       </w:pPr>
       <w:r>
@@ -1484,6 +1519,10 @@
           <w:ilvl w:val="0"/>
           <w:numId w:val="2"/>
         </w:numPr>
+        <w:tabs>
+          <w:tab w:val="clear" w:pos="720"/>
+        </w:tabs>
+        <w:ind w:left="426"/>
         <w:jc w:val="both"/>
       </w:pPr>
       <w:r>
@@ -1657,11 +1696,7 @@
       </w:r>
       <w:proofErr w:type="spellEnd"/>
       <w:r>
-        <w:t xml:space="preserve"> </w:t>
-      </w:r>
-      <w:r>
-        <w:lastRenderedPageBreak/>
-        <w:t>"</w:t>
+        <w:t xml:space="preserve"> "</w:t>
       </w:r>
       <w:proofErr w:type="spellStart"/>
       <w:r>
@@ -1767,6 +1802,7 @@
     </w:p>
     <w:p>
       <w:pPr>
+        <w:ind w:left="-284"/>
         <w:jc w:val="both"/>
         <w:rPr>
           <w:b/>
@@ -1805,13 +1841,6 @@
         <w:t>DownTime</w:t>
       </w:r>
       <w:proofErr w:type="spellEnd"/>
-      <w:r>
-        <w:rPr>
-          <w:b/>
-          <w:bCs/>
-        </w:rPr>
-        <w:t xml:space="preserve"> (Strategi Hemat)</w:t>
-      </w:r>
     </w:p>
     <w:p>
       <w:pPr>
@@ -1893,8 +1922,12 @@
       <w:pPr>
         <w:numPr>
           <w:ilvl w:val="0"/>
-          <w:numId w:val="3"/>
+          <w:numId w:val="7"/>
         </w:numPr>
+        <w:tabs>
+          <w:tab w:val="clear" w:pos="720"/>
+        </w:tabs>
+        <w:ind w:left="426"/>
         <w:jc w:val="both"/>
       </w:pPr>
       <w:r>
@@ -2032,8 +2065,12 @@
       <w:pPr>
         <w:numPr>
           <w:ilvl w:val="0"/>
-          <w:numId w:val="3"/>
+          <w:numId w:val="7"/>
         </w:numPr>
+        <w:tabs>
+          <w:tab w:val="clear" w:pos="720"/>
+        </w:tabs>
+        <w:ind w:left="426"/>
         <w:jc w:val="both"/>
       </w:pPr>
       <w:r>
@@ -2099,8 +2136,12 @@
       <w:pPr>
         <w:numPr>
           <w:ilvl w:val="0"/>
-          <w:numId w:val="3"/>
+          <w:numId w:val="7"/>
         </w:numPr>
+        <w:tabs>
+          <w:tab w:val="clear" w:pos="720"/>
+        </w:tabs>
+        <w:ind w:left="426"/>
         <w:jc w:val="both"/>
       </w:pPr>
       <w:r>
@@ -2317,24 +2358,31 @@
           <w:b/>
           <w:bCs/>
         </w:rPr>
-        <w:t>Analisa Layanan (</w:t>
-      </w:r>
-      <w:proofErr w:type="spellStart"/>
-      <w:r>
-        <w:rPr>
-          <w:b/>
-          <w:bCs/>
-        </w:rPr>
-        <w:t>Biaya</w:t>
-      </w:r>
-      <w:proofErr w:type="spellEnd"/>
-      <w:r>
-        <w:rPr>
-          <w:b/>
-          <w:bCs/>
-        </w:rPr>
-        <w:t xml:space="preserve"> Minimum):</w:t>
-      </w:r>
+        <w:t xml:space="preserve">Analisa </w:t>
+      </w:r>
+      <w:proofErr w:type="gramStart"/>
+      <w:r>
+        <w:rPr>
+          <w:b/>
+          <w:bCs/>
+        </w:rPr>
+        <w:t>Layanan</w:t>
+      </w:r>
+      <w:r>
+        <w:rPr>
+          <w:b/>
+          <w:bCs/>
+        </w:rPr>
+        <w:t xml:space="preserve"> </w:t>
+      </w:r>
+      <w:r>
+        <w:rPr>
+          <w:b/>
+          <w:bCs/>
+        </w:rPr>
+        <w:t>:</w:t>
+      </w:r>
+      <w:proofErr w:type="gramEnd"/>
     </w:p>
     <w:p>
       <w:pPr>
@@ -2342,6 +2390,10 @@
           <w:ilvl w:val="0"/>
           <w:numId w:val="4"/>
         </w:numPr>
+        <w:tabs>
+          <w:tab w:val="clear" w:pos="720"/>
+        </w:tabs>
+        <w:ind w:left="426"/>
         <w:jc w:val="both"/>
       </w:pPr>
       <w:r>
@@ -2483,6 +2535,10 @@
           <w:ilvl w:val="0"/>
           <w:numId w:val="4"/>
         </w:numPr>
+        <w:tabs>
+          <w:tab w:val="clear" w:pos="720"/>
+        </w:tabs>
+        <w:ind w:left="426"/>
         <w:jc w:val="both"/>
       </w:pPr>
       <w:r>
@@ -2617,6 +2673,10 @@
           <w:ilvl w:val="0"/>
           <w:numId w:val="4"/>
         </w:numPr>
+        <w:tabs>
+          <w:tab w:val="clear" w:pos="720"/>
+        </w:tabs>
+        <w:ind w:left="426"/>
         <w:jc w:val="both"/>
       </w:pPr>
       <w:r>
@@ -2750,23 +2810,7 @@
       </w:r>
       <w:proofErr w:type="spellEnd"/>
       <w:r>
-        <w:t xml:space="preserve"> (Beli </w:t>
-      </w:r>
-      <w:proofErr w:type="spellStart"/>
-      <w:r>
-        <w:t>Putus</w:t>
-      </w:r>
-      <w:proofErr w:type="spellEnd"/>
-      <w:r>
-        <w:t xml:space="preserve"> / </w:t>
-      </w:r>
-      <w:proofErr w:type="spellStart"/>
-      <w:r>
-        <w:t>Investasi</w:t>
-      </w:r>
-      <w:proofErr w:type="spellEnd"/>
-      <w:r>
-        <w:t xml:space="preserve"> Awal)</w:t>
+        <w:t>:</w:t>
       </w:r>
     </w:p>
     <w:tbl>
@@ -2927,7 +2971,7 @@
                 <w:b/>
                 <w:bCs/>
               </w:rPr>
-              <w:t>2 Unit Server Rackmount</w:t>
+              <w:t>2 Unit Server</w:t>
             </w:r>
           </w:p>
         </w:tc>
@@ -2981,7 +3025,7 @@
               <w:jc w:val="center"/>
             </w:pPr>
             <w:r>
-              <w:t>Rp120.000.000 (Rp60jt x 2)</w:t>
+              <w:t>Rp120.000.000</w:t>
             </w:r>
           </w:p>
         </w:tc>
@@ -3107,7 +3151,6 @@
                 <w:b/>
                 <w:bCs/>
               </w:rPr>
-              <w:lastRenderedPageBreak/>
               <w:t>UPS (Backup Listrik)</w:t>
             </w:r>
           </w:p>
@@ -3198,6 +3241,7 @@
                 <w:b/>
                 <w:bCs/>
               </w:rPr>
+              <w:lastRenderedPageBreak/>
               <w:t>Software OS &amp; DB</w:t>
             </w:r>
           </w:p>
@@ -3967,7 +4011,6 @@
                 <w:b/>
                 <w:bCs/>
               </w:rPr>
-              <w:lastRenderedPageBreak/>
               <w:t>TOTAL BIAYA BULANAN</w:t>
             </w:r>
           </w:p>
@@ -4038,11 +4081,21 @@
           <w:bCs/>
         </w:rPr>
       </w:pPr>
-      <w:r>
-        <w:rPr>
-          <w:b/>
-          <w:bCs/>
-        </w:rPr>
+    </w:p>
+    <w:p>
+      <w:pPr>
+        <w:jc w:val="both"/>
+        <w:rPr>
+          <w:b/>
+          <w:bCs/>
+        </w:rPr>
+      </w:pPr>
+      <w:r>
+        <w:rPr>
+          <w:b/>
+          <w:bCs/>
+        </w:rPr>
+        <w:lastRenderedPageBreak/>
         <w:t xml:space="preserve">Kesimpulan </w:t>
       </w:r>
       <w:proofErr w:type="spellStart"/>
@@ -4068,6 +4121,11 @@
           <w:ilvl w:val="0"/>
           <w:numId w:val="5"/>
         </w:numPr>
+        <w:tabs>
+          <w:tab w:val="clear" w:pos="720"/>
+          <w:tab w:val="num" w:pos="426"/>
+        </w:tabs>
+        <w:ind w:left="426"/>
         <w:jc w:val="both"/>
       </w:pPr>
       <w:r>
@@ -4127,6 +4185,11 @@
           <w:ilvl w:val="0"/>
           <w:numId w:val="5"/>
         </w:numPr>
+        <w:tabs>
+          <w:tab w:val="clear" w:pos="720"/>
+          <w:tab w:val="num" w:pos="426"/>
+        </w:tabs>
+        <w:ind w:left="426"/>
         <w:jc w:val="both"/>
       </w:pPr>
       <w:proofErr w:type="spellStart"/>
@@ -4179,6 +4242,11 @@
           <w:ilvl w:val="0"/>
           <w:numId w:val="5"/>
         </w:numPr>
+        <w:tabs>
+          <w:tab w:val="clear" w:pos="720"/>
+          <w:tab w:val="num" w:pos="426"/>
+        </w:tabs>
+        <w:ind w:left="426"/>
         <w:jc w:val="both"/>
       </w:pPr>
       <w:proofErr w:type="spellStart"/>
@@ -4458,6 +4526,107 @@
       <w:proofErr w:type="spellEnd"/>
       <w:r>
         <w:t>.</w:t>
+      </w:r>
+    </w:p>
+    <w:p>
+      <w:pPr>
+        <w:jc w:val="both"/>
+      </w:pPr>
+    </w:p>
+    <w:p>
+      <w:pPr>
+        <w:jc w:val="both"/>
+      </w:pPr>
+      <w:proofErr w:type="spellStart"/>
+      <w:r>
+        <w:t>Berikut</w:t>
+      </w:r>
+      <w:proofErr w:type="spellEnd"/>
+      <w:r>
+        <w:t xml:space="preserve"> </w:t>
+      </w:r>
+      <w:proofErr w:type="spellStart"/>
+      <w:r>
+        <w:t>ini</w:t>
+      </w:r>
+      <w:proofErr w:type="spellEnd"/>
+      <w:r>
+        <w:t xml:space="preserve"> </w:t>
+      </w:r>
+      <w:proofErr w:type="spellStart"/>
+      <w:r>
+        <w:t>desain</w:t>
+      </w:r>
+      <w:proofErr w:type="spellEnd"/>
+      <w:r>
+        <w:t xml:space="preserve"> </w:t>
+      </w:r>
+      <w:proofErr w:type="spellStart"/>
+      <w:r>
+        <w:t>alurnya</w:t>
+      </w:r>
+      <w:proofErr w:type="spellEnd"/>
+      <w:r>
+        <w:t>:</w:t>
+      </w:r>
+    </w:p>
+    <w:p>
+      <w:pPr>
+        <w:pStyle w:val="NormalWeb"/>
+        <w:ind w:left="360"/>
+      </w:pPr>
+      <w:r>
+        <w:rPr>
+          <w:noProof/>
+        </w:rPr>
+        <w:drawing>
+          <wp:inline distT="0" distB="0" distL="0" distR="0" wp14:anchorId="19193A29" wp14:editId="79D5FD2C">
+            <wp:extent cx="5016500" cy="2736121"/>
+            <wp:effectExtent l="0" t="0" r="0" b="7620"/>
+            <wp:docPr id="1491325590" name="Picture 1"/>
+            <wp:cNvGraphicFramePr>
+              <a:graphicFrameLocks xmlns:a="http://schemas.openxmlformats.org/drawingml/2006/main" noChangeAspect="1"/>
+            </wp:cNvGraphicFramePr>
+            <a:graphic xmlns:a="http://schemas.openxmlformats.org/drawingml/2006/main">
+              <a:graphicData uri="http://schemas.openxmlformats.org/drawingml/2006/picture">
+                <pic:pic xmlns:pic="http://schemas.openxmlformats.org/drawingml/2006/picture">
+                  <pic:nvPicPr>
+                    <pic:cNvPr id="0" name="Picture 3"/>
+                    <pic:cNvPicPr>
+                      <a:picLocks noChangeAspect="1" noChangeArrowheads="1"/>
+                    </pic:cNvPicPr>
+                  </pic:nvPicPr>
+                  <pic:blipFill>
+                    <a:blip r:embed="rId6" cstate="print">
+                      <a:extLst>
+                        <a:ext uri="{28A0092B-C50C-407E-A947-70E740481C1C}">
+                          <a14:useLocalDpi xmlns:a14="http://schemas.microsoft.com/office/drawing/2010/main" val="0"/>
+                        </a:ext>
+                      </a:extLst>
+                    </a:blip>
+                    <a:srcRect/>
+                    <a:stretch>
+                      <a:fillRect/>
+                    </a:stretch>
+                  </pic:blipFill>
+                  <pic:spPr bwMode="auto">
+                    <a:xfrm>
+                      <a:off x="0" y="0"/>
+                      <a:ext cx="5029063" cy="2742973"/>
+                    </a:xfrm>
+                    <a:prstGeom prst="rect">
+                      <a:avLst/>
+                    </a:prstGeom>
+                    <a:noFill/>
+                    <a:ln>
+                      <a:noFill/>
+                    </a:ln>
+                  </pic:spPr>
+                </pic:pic>
+              </a:graphicData>
+            </a:graphic>
+          </wp:inline>
+        </w:drawing>
       </w:r>
     </w:p>
     <w:p>
@@ -4523,7 +4692,7 @@
         <w:sz w:val="20"/>
       </w:rPr>
     </w:lvl>
-    <w:lvl w:ilvl="2" w:tentative="1">
+    <w:lvl w:ilvl="2">
       <w:start w:val="1"/>
       <w:numFmt w:val="bullet"/>
       <w:lvlText w:val=""/>
@@ -5048,6 +5217,122 @@
     </w:lvl>
   </w:abstractNum>
   <w:abstractNum w:abstractNumId="4" w15:restartNumberingAfterBreak="0">
+    <w:nsid w:val="45E34BFC"/>
+    <w:multiLevelType w:val="multilevel"/>
+    <w:tmpl w:val="F5B273B6"/>
+    <w:lvl w:ilvl="0">
+      <w:start w:val="1"/>
+      <w:numFmt w:val="bullet"/>
+      <w:lvlText w:val=""/>
+      <w:lvlJc w:val="left"/>
+      <w:pPr>
+        <w:tabs>
+          <w:tab w:val="num" w:pos="720"/>
+        </w:tabs>
+        <w:ind w:left="720" w:hanging="360"/>
+      </w:pPr>
+      <w:rPr>
+        <w:rFonts w:ascii="Symbol" w:hAnsi="Symbol" w:hint="default"/>
+      </w:rPr>
+    </w:lvl>
+    <w:lvl w:ilvl="1" w:tentative="1">
+      <w:start w:val="1"/>
+      <w:numFmt w:val="decimal"/>
+      <w:lvlText w:val="%2."/>
+      <w:lvlJc w:val="left"/>
+      <w:pPr>
+        <w:tabs>
+          <w:tab w:val="num" w:pos="1440"/>
+        </w:tabs>
+        <w:ind w:left="1440" w:hanging="360"/>
+      </w:pPr>
+    </w:lvl>
+    <w:lvl w:ilvl="2" w:tentative="1">
+      <w:start w:val="1"/>
+      <w:numFmt w:val="decimal"/>
+      <w:lvlText w:val="%3."/>
+      <w:lvlJc w:val="left"/>
+      <w:pPr>
+        <w:tabs>
+          <w:tab w:val="num" w:pos="2160"/>
+        </w:tabs>
+        <w:ind w:left="2160" w:hanging="360"/>
+      </w:pPr>
+    </w:lvl>
+    <w:lvl w:ilvl="3" w:tentative="1">
+      <w:start w:val="1"/>
+      <w:numFmt w:val="decimal"/>
+      <w:lvlText w:val="%4."/>
+      <w:lvlJc w:val="left"/>
+      <w:pPr>
+        <w:tabs>
+          <w:tab w:val="num" w:pos="2880"/>
+        </w:tabs>
+        <w:ind w:left="2880" w:hanging="360"/>
+      </w:pPr>
+    </w:lvl>
+    <w:lvl w:ilvl="4" w:tentative="1">
+      <w:start w:val="1"/>
+      <w:numFmt w:val="decimal"/>
+      <w:lvlText w:val="%5."/>
+      <w:lvlJc w:val="left"/>
+      <w:pPr>
+        <w:tabs>
+          <w:tab w:val="num" w:pos="3600"/>
+        </w:tabs>
+        <w:ind w:left="3600" w:hanging="360"/>
+      </w:pPr>
+    </w:lvl>
+    <w:lvl w:ilvl="5" w:tentative="1">
+      <w:start w:val="1"/>
+      <w:numFmt w:val="decimal"/>
+      <w:lvlText w:val="%6."/>
+      <w:lvlJc w:val="left"/>
+      <w:pPr>
+        <w:tabs>
+          <w:tab w:val="num" w:pos="4320"/>
+        </w:tabs>
+        <w:ind w:left="4320" w:hanging="360"/>
+      </w:pPr>
+    </w:lvl>
+    <w:lvl w:ilvl="6" w:tentative="1">
+      <w:start w:val="1"/>
+      <w:numFmt w:val="decimal"/>
+      <w:lvlText w:val="%7."/>
+      <w:lvlJc w:val="left"/>
+      <w:pPr>
+        <w:tabs>
+          <w:tab w:val="num" w:pos="5040"/>
+        </w:tabs>
+        <w:ind w:left="5040" w:hanging="360"/>
+      </w:pPr>
+    </w:lvl>
+    <w:lvl w:ilvl="7" w:tentative="1">
+      <w:start w:val="1"/>
+      <w:numFmt w:val="decimal"/>
+      <w:lvlText w:val="%8."/>
+      <w:lvlJc w:val="left"/>
+      <w:pPr>
+        <w:tabs>
+          <w:tab w:val="num" w:pos="5760"/>
+        </w:tabs>
+        <w:ind w:left="5760" w:hanging="360"/>
+      </w:pPr>
+    </w:lvl>
+    <w:lvl w:ilvl="8" w:tentative="1">
+      <w:start w:val="1"/>
+      <w:numFmt w:val="decimal"/>
+      <w:lvlText w:val="%9."/>
+      <w:lvlJc w:val="left"/>
+      <w:pPr>
+        <w:tabs>
+          <w:tab w:val="num" w:pos="6480"/>
+        </w:tabs>
+        <w:ind w:left="6480" w:hanging="360"/>
+      </w:pPr>
+    </w:lvl>
+  </w:abstractNum>
+  <w:abstractNum w:abstractNumId="5" w15:restartNumberingAfterBreak="0">
     <w:nsid w:val="5759335D"/>
     <w:multiLevelType w:val="multilevel"/>
     <w:tmpl w:val="7AD018F2"/>
@@ -5196,7 +5481,7 @@
       </w:rPr>
     </w:lvl>
   </w:abstractNum>
-  <w:abstractNum w:abstractNumId="5" w15:restartNumberingAfterBreak="0">
+  <w:abstractNum w:abstractNumId="6" w15:restartNumberingAfterBreak="0">
     <w:nsid w:val="61DC7183"/>
     <w:multiLevelType w:val="multilevel"/>
     <w:tmpl w:val="1BF4B3DA"/>
@@ -5310,7 +5595,7 @@
     </w:lvl>
   </w:abstractNum>
   <w:num w:numId="1" w16cid:durableId="1116292535">
-    <w:abstractNumId w:val="4"/>
+    <w:abstractNumId w:val="5"/>
   </w:num>
   <w:num w:numId="2" w16cid:durableId="961689060">
     <w:abstractNumId w:val="3"/>
@@ -5322,10 +5607,13 @@
     <w:abstractNumId w:val="2"/>
   </w:num>
   <w:num w:numId="5" w16cid:durableId="604576369">
-    <w:abstractNumId w:val="5"/>
+    <w:abstractNumId w:val="6"/>
   </w:num>
   <w:num w:numId="6" w16cid:durableId="1047535970">
     <w:abstractNumId w:val="0"/>
+  </w:num>
+  <w:num w:numId="7" w16cid:durableId="1151362868">
+    <w:abstractNumId w:val="4"/>
   </w:num>
 </w:numbering>
 </file>
@@ -6247,6 +6535,23 @@
       <w:spacing w:val="5"/>
     </w:rPr>
   </w:style>
+  <w:style w:type="paragraph" w:styleId="NormalWeb">
+    <w:name w:val="Normal (Web)"/>
+    <w:basedOn w:val="Normal"/>
+    <w:uiPriority w:val="99"/>
+    <w:semiHidden/>
+    <w:unhideWhenUsed/>
+    <w:rsid w:val="008C11A6"/>
+    <w:pPr>
+      <w:spacing w:before="100" w:beforeAutospacing="1" w:after="100" w:afterAutospacing="1" w:line="240" w:lineRule="auto"/>
+    </w:pPr>
+    <w:rPr>
+      <w:rFonts w:ascii="Times New Roman" w:eastAsia="Times New Roman" w:hAnsi="Times New Roman" w:cs="Times New Roman"/>
+      <w:kern w:val="0"/>
+      <w:lang w:eastAsia="en-ID"/>
+      <w14:ligatures w14:val="none"/>
+    </w:rPr>
+  </w:style>
 </w:styles>
 </file>
 

</xml_diff>